<commit_message>
fix: bug de janeiro tabela5 corrigido
</commit_message>
<xml_diff>
--- a/outputs/2025/01janeiro/Relatorio_Gerencial_Completo_2025-01.docx
+++ b/outputs/2025/01janeiro/Relatorio_Gerencial_Completo_2025-01.docx
@@ -673,6 +673,7 @@
     </w:p>
     <w:p>
       <w:pPr>
+        <w:keepNext/>
         <w:spacing w:before="240" w:after="120"/>
         <w:jc w:val="center"/>
       </w:pPr>
@@ -10608,6 +10609,7 @@
     </w:tbl>
     <w:p>
       <w:pPr>
+        <w:keepNext/>
         <w:spacing w:before="120"/>
       </w:pPr>
       <w:r>
@@ -11120,7 +11122,7 @@
         <w:pStyle w:val="CorpoComRecuo"/>
       </w:pPr>
       <w:r>
-        <w:t>Com base na tabela acima, observa-se que o total arrecadado em janeiro de 2025 apresentou um aumento de 100.00% em relação a dezembro de 2024. Essa variação foi impulsionada, sobretudo, pela arrecadação da contribuição normal.</w:t>
+        <w:t>Com base na tabela acima, observa-se que o total arrecadado em janeiro de 2025 apresentou uma queda de 35.14% em relação a dezembro de 2024. Essa variação foi impulsionada, sobretudo, pela arrecadação da contribuição normal.</w:t>
       </w:r>
     </w:p>
     <w:p>
@@ -11364,6 +11366,7 @@
     </w:p>
     <w:p>
       <w:pPr>
+        <w:keepNext/>
         <w:jc w:val="center"/>
       </w:pPr>
       <w:r>
@@ -22558,6 +22561,9 @@
       </w:tr>
     </w:tbl>
     <w:p>
+      <w:pPr>
+        <w:keepNext/>
+      </w:pPr>
       <w:r>
         <w:t>Fonte: DISEG/GEARC</w:t>
       </w:r>

</xml_diff>

<commit_message>
fix: tabela5 e gráfico de faixa etária corrigidos
</commit_message>
<xml_diff>
--- a/outputs/2025/01janeiro/Relatorio_Gerencial_Completo_2025-01.docx
+++ b/outputs/2025/01janeiro/Relatorio_Gerencial_Completo_2025-01.docx
@@ -325,7 +325,7 @@
       <w:r>
         <w:drawing>
           <wp:inline xmlns:a="http://schemas.openxmlformats.org/drawingml/2006/main" xmlns:pic="http://schemas.openxmlformats.org/drawingml/2006/picture">
-            <wp:extent cx="5669280" cy="1978342"/>
+            <wp:extent cx="5669280" cy="2125980"/>
             <wp:docPr id="9" name="Picture 9"/>
             <wp:cNvGraphicFramePr>
               <a:graphicFrameLocks noChangeAspect="1"/>
@@ -346,7 +346,7 @@
                   <pic:spPr>
                     <a:xfrm>
                       <a:off x="0" y="0"/>
-                      <a:ext cx="5669280" cy="1978342"/>
+                      <a:ext cx="5669280" cy="2125980"/>
                     </a:xfrm>
                     <a:prstGeom prst="rect"/>
                   </pic:spPr>
@@ -355,11 +355,6 @@
             </a:graphic>
           </wp:inline>
         </w:drawing>
-      </w:r>
-    </w:p>
-    <w:p>
-      <w:r>
-        <w:t>Fonte: DISEG/GEARC</w:t>
       </w:r>
     </w:p>
     <w:p>
@@ -383,7 +378,7 @@
       <w:r>
         <w:drawing>
           <wp:inline xmlns:a="http://schemas.openxmlformats.org/drawingml/2006/main" xmlns:pic="http://schemas.openxmlformats.org/drawingml/2006/picture">
-            <wp:extent cx="5486400" cy="850392"/>
+            <wp:extent cx="5486400" cy="1033272"/>
             <wp:docPr id="10" name="Picture 10"/>
             <wp:cNvGraphicFramePr>
               <a:graphicFrameLocks noChangeAspect="1"/>
@@ -404,7 +399,7 @@
                   <pic:spPr>
                     <a:xfrm>
                       <a:off x="0" y="0"/>
-                      <a:ext cx="5486400" cy="850392"/>
+                      <a:ext cx="5486400" cy="1033272"/>
                     </a:xfrm>
                     <a:prstGeom prst="rect"/>
                   </pic:spPr>
@@ -444,7 +439,7 @@
       <w:r>
         <w:drawing>
           <wp:inline xmlns:a="http://schemas.openxmlformats.org/drawingml/2006/main" xmlns:pic="http://schemas.openxmlformats.org/drawingml/2006/picture">
-            <wp:extent cx="5669280" cy="3932405"/>
+            <wp:extent cx="5669280" cy="3885646"/>
             <wp:docPr id="11" name="Picture 11"/>
             <wp:cNvGraphicFramePr>
               <a:graphicFrameLocks noChangeAspect="1"/>
@@ -465,7 +460,7 @@
                   <pic:spPr>
                     <a:xfrm>
                       <a:off x="0" y="0"/>
-                      <a:ext cx="5669280" cy="3932405"/>
+                      <a:ext cx="5669280" cy="3885646"/>
                     </a:xfrm>
                     <a:prstGeom prst="rect"/>
                   </pic:spPr>
@@ -474,11 +469,6 @@
             </a:graphic>
           </wp:inline>
         </w:drawing>
-      </w:r>
-    </w:p>
-    <w:p>
-      <w:r>
-        <w:t>Fonte: DISEG/GEARC</w:t>
       </w:r>
     </w:p>
     <w:p>
@@ -507,7 +497,7 @@
       <w:r>
         <w:drawing>
           <wp:inline xmlns:a="http://schemas.openxmlformats.org/drawingml/2006/main" xmlns:pic="http://schemas.openxmlformats.org/drawingml/2006/picture">
-            <wp:extent cx="3657600" cy="2145792"/>
+            <wp:extent cx="3657600" cy="2267712"/>
             <wp:docPr id="12" name="Picture 12"/>
             <wp:cNvGraphicFramePr>
               <a:graphicFrameLocks noChangeAspect="1"/>
@@ -528,7 +518,7 @@
                   <pic:spPr>
                     <a:xfrm>
                       <a:off x="0" y="0"/>
-                      <a:ext cx="3657600" cy="2145792"/>
+                      <a:ext cx="3657600" cy="2267712"/>
                     </a:xfrm>
                     <a:prstGeom prst="rect"/>
                   </pic:spPr>
@@ -537,14 +527,6 @@
             </a:graphic>
           </wp:inline>
         </w:drawing>
-      </w:r>
-    </w:p>
-    <w:p>
-      <w:pPr>
-        <w:spacing w:before="120"/>
-      </w:pPr>
-      <w:r>
-        <w:t>Fonte: DISEG/GEARC</w:t>
       </w:r>
     </w:p>
     <w:p>
@@ -609,11 +591,6 @@
       </w:r>
     </w:p>
     <w:p>
-      <w:r>
-        <w:t>Fonte: DISEG/GEARC</w:t>
-      </w:r>
-    </w:p>
-    <w:p>
       <w:pPr>
         <w:jc w:val="center"/>
       </w:pPr>
@@ -655,11 +632,6 @@
             </a:graphic>
           </wp:inline>
         </w:drawing>
-      </w:r>
-    </w:p>
-    <w:p>
-      <w:r>
-        <w:t>Fonte: DISEG/GEARC</w:t>
       </w:r>
     </w:p>
     <w:p>
@@ -10692,7 +10664,7 @@
       <w:r>
         <w:drawing>
           <wp:inline xmlns:a="http://schemas.openxmlformats.org/drawingml/2006/main" xmlns:pic="http://schemas.openxmlformats.org/drawingml/2006/picture">
-            <wp:extent cx="4572000" cy="2853950"/>
+            <wp:extent cx="4572000" cy="2955769"/>
             <wp:docPr id="15" name="Picture 15"/>
             <wp:cNvGraphicFramePr>
               <a:graphicFrameLocks noChangeAspect="1"/>
@@ -10713,7 +10685,7 @@
                   <pic:spPr>
                     <a:xfrm>
                       <a:off x="0" y="0"/>
-                      <a:ext cx="4572000" cy="2853950"/>
+                      <a:ext cx="4572000" cy="2955769"/>
                     </a:xfrm>
                     <a:prstGeom prst="rect"/>
                   </pic:spPr>
@@ -10739,7 +10711,7 @@
       <w:r>
         <w:drawing>
           <wp:inline xmlns:a="http://schemas.openxmlformats.org/drawingml/2006/main" xmlns:pic="http://schemas.openxmlformats.org/drawingml/2006/picture">
-            <wp:extent cx="4572000" cy="2853950"/>
+            <wp:extent cx="4572000" cy="2955769"/>
             <wp:docPr id="16" name="Picture 16"/>
             <wp:cNvGraphicFramePr>
               <a:graphicFrameLocks noChangeAspect="1"/>
@@ -10760,7 +10732,7 @@
                   <pic:spPr>
                     <a:xfrm>
                       <a:off x="0" y="0"/>
-                      <a:ext cx="4572000" cy="2853950"/>
+                      <a:ext cx="4572000" cy="2955769"/>
                     </a:xfrm>
                     <a:prstGeom prst="rect"/>
                   </pic:spPr>
@@ -10769,11 +10741,6 @@
             </a:graphic>
           </wp:inline>
         </w:drawing>
-      </w:r>
-    </w:p>
-    <w:p>
-      <w:r>
-        <w:t>Fonte: DISEG/GEARC</w:t>
       </w:r>
     </w:p>
     <w:p>
@@ -10798,7 +10765,7 @@
         <w:pStyle w:val="CorpoComRecuo"/>
       </w:pPr>
       <w:r>
-        <w:t>Para os participantes vinculados a melhor opção é a escolha do percentual mínimo (6,5%), com o objetivo de aproveitar a isenção da taxa de carregamento sobre a contribuição facultativa. Em janeiro/2025, 100.00% dos participantes vinculados optaram pelo percentual de 6,5% e a opção pelo percentual mínimo chega a 93.45% da preferência dos participantes desde o início do funcionamento do plano.</w:t>
+        <w:t>Para os participantes vinculados a melhor opção é a escolha do percentual mínimo (6,5%), com o objetivo de aproveitar a isenção da taxa de carregamento sobre a contribuição facultativa. Em janeiro/2025, 100.00% dos participantes vinculados optaram pelo percentual de 6,5% e a opção pelo percentual mínimo chega a 93.43% da preferência dos participantes desde o início do funcionamento do plano.</w:t>
       </w:r>
     </w:p>
     <w:p>
@@ -10854,11 +10821,6 @@
       </w:r>
     </w:p>
     <w:p>
-      <w:r>
-        <w:t>Fonte: DISEG/GEARC</w:t>
-      </w:r>
-    </w:p>
-    <w:p>
       <w:pPr>
         <w:jc w:val="center"/>
       </w:pPr>
@@ -10903,11 +10865,6 @@
       </w:r>
     </w:p>
     <w:p>
-      <w:r>
-        <w:t>Fonte: DISEG/GEARC</w:t>
-      </w:r>
-    </w:p>
-    <w:p>
       <w:pPr>
         <w:pStyle w:val="Título2"/>
       </w:pPr>
@@ -10939,7 +10896,7 @@
       <w:r>
         <w:drawing>
           <wp:inline xmlns:a="http://schemas.openxmlformats.org/drawingml/2006/main" xmlns:pic="http://schemas.openxmlformats.org/drawingml/2006/picture">
-            <wp:extent cx="3657600" cy="1018032"/>
+            <wp:extent cx="3657600" cy="1139952"/>
             <wp:docPr id="19" name="Picture 19"/>
             <wp:cNvGraphicFramePr>
               <a:graphicFrameLocks noChangeAspect="1"/>
@@ -10960,7 +10917,7 @@
                   <pic:spPr>
                     <a:xfrm>
                       <a:off x="0" y="0"/>
-                      <a:ext cx="3657600" cy="1018032"/>
+                      <a:ext cx="3657600" cy="1139952"/>
                     </a:xfrm>
                     <a:prstGeom prst="rect"/>
                   </pic:spPr>
@@ -10969,11 +10926,6 @@
             </a:graphic>
           </wp:inline>
         </w:drawing>
-      </w:r>
-    </w:p>
-    <w:p>
-      <w:r>
-        <w:t>Fonte: DISEG/GEARC</w:t>
       </w:r>
     </w:p>
     <w:p>
@@ -11011,7 +10963,7 @@
       <w:r>
         <w:drawing>
           <wp:inline xmlns:a="http://schemas.openxmlformats.org/drawingml/2006/main" xmlns:pic="http://schemas.openxmlformats.org/drawingml/2006/picture">
-            <wp:extent cx="4572000" cy="3588031"/>
+            <wp:extent cx="4572000" cy="3890608"/>
             <wp:docPr id="20" name="Picture 20"/>
             <wp:cNvGraphicFramePr>
               <a:graphicFrameLocks noChangeAspect="1"/>
@@ -11032,7 +10984,7 @@
                   <pic:spPr>
                     <a:xfrm>
                       <a:off x="0" y="0"/>
-                      <a:ext cx="4572000" cy="3588031"/>
+                      <a:ext cx="4572000" cy="3890608"/>
                     </a:xfrm>
                     <a:prstGeom prst="rect"/>
                   </pic:spPr>
@@ -11041,14 +10993,6 @@
             </a:graphic>
           </wp:inline>
         </w:drawing>
-      </w:r>
-    </w:p>
-    <w:p>
-      <w:pPr>
-        <w:spacing w:before="120"/>
-      </w:pPr>
-      <w:r>
-        <w:t>Fonte: DISEG/GEARC</w:t>
       </w:r>
     </w:p>
     <w:p>
@@ -11080,7 +11024,7 @@
       <w:r>
         <w:drawing>
           <wp:inline xmlns:a="http://schemas.openxmlformats.org/drawingml/2006/main" xmlns:pic="http://schemas.openxmlformats.org/drawingml/2006/picture">
-            <wp:extent cx="5669280" cy="3325978"/>
+            <wp:extent cx="5669280" cy="3514954"/>
             <wp:docPr id="21" name="Picture 21"/>
             <wp:cNvGraphicFramePr>
               <a:graphicFrameLocks noChangeAspect="1"/>
@@ -11101,7 +11045,7 @@
                   <pic:spPr>
                     <a:xfrm>
                       <a:off x="0" y="0"/>
-                      <a:ext cx="5669280" cy="3325978"/>
+                      <a:ext cx="5669280" cy="3514954"/>
                     </a:xfrm>
                     <a:prstGeom prst="rect"/>
                   </pic:spPr>
@@ -11110,11 +11054,6 @@
             </a:graphic>
           </wp:inline>
         </w:drawing>
-      </w:r>
-    </w:p>
-    <w:p>
-      <w:r>
-        <w:t>Fonte: DISEG/GEARC</w:t>
       </w:r>
     </w:p>
     <w:p>
@@ -11188,7 +11127,7 @@
       <w:r>
         <w:drawing>
           <wp:inline xmlns:a="http://schemas.openxmlformats.org/drawingml/2006/main" xmlns:pic="http://schemas.openxmlformats.org/drawingml/2006/picture">
-            <wp:extent cx="5669280" cy="2005952"/>
+            <wp:extent cx="5669280" cy="2137490"/>
             <wp:docPr id="22" name="Picture 22"/>
             <wp:cNvGraphicFramePr>
               <a:graphicFrameLocks noChangeAspect="1"/>
@@ -11209,7 +11148,7 @@
                   <pic:spPr>
                     <a:xfrm>
                       <a:off x="0" y="0"/>
-                      <a:ext cx="5669280" cy="2005952"/>
+                      <a:ext cx="5669280" cy="2137490"/>
                     </a:xfrm>
                     <a:prstGeom prst="rect"/>
                   </pic:spPr>
@@ -11218,11 +11157,6 @@
             </a:graphic>
           </wp:inline>
         </w:drawing>
-      </w:r>
-    </w:p>
-    <w:p>
-      <w:r>
-        <w:t>Fonte: DISEG/GEARC</w:t>
       </w:r>
     </w:p>
     <w:p>
@@ -11290,11 +11224,6 @@
       </w:r>
     </w:p>
     <w:p>
-      <w:r>
-        <w:t>Fonte: DISEG/GEARC</w:t>
-      </w:r>
-    </w:p>
-    <w:p>
       <w:pPr>
         <w:jc w:val="center"/>
       </w:pPr>
@@ -11340,11 +11269,6 @@
             </a:graphic>
           </wp:inline>
         </w:drawing>
-      </w:r>
-    </w:p>
-    <w:p>
-      <w:r>
-        <w:t>Fonte: DISEG/GEARC</w:t>
       </w:r>
     </w:p>
     <w:p>

</xml_diff>